<commit_message>
Use docxtemplater image module for signature placement
Replace hardcoded pdf-lib coordinate overlay with {%signature_client}
and {%signature_rep} placeholders embedded directly in the DOCX templates.
Each template controls its own signature positions — no more coordinate math.

Co-Authored-By: Claude Sonnet 4.6 <noreply@anthropic.com>
</commit_message>
<xml_diff>
--- a/src/lib/contracts/template-en.docx
+++ b/src/lib/contracts/template-en.docx
@@ -12,12 +12,12 @@
           <wp:inline distB="114300" distT="114300" distL="114300" distR="114300">
             <wp:extent cx="5731200" cy="5067300"/>
             <wp:effectExtent b="0" l="0" r="0" t="0"/>
-            <wp:docPr id="6" name="image1.png"/>
+            <wp:docPr id="6" name="image3.png"/>
             <a:graphic>
               <a:graphicData uri="http://schemas.openxmlformats.org/drawingml/2006/picture">
                 <pic:pic>
                   <pic:nvPicPr>
-                    <pic:cNvPr id="0" name="image1.png"/>
+                    <pic:cNvPr id="0" name="image3.png"/>
                     <pic:cNvPicPr preferRelativeResize="0"/>
                   </pic:nvPicPr>
                   <pic:blipFill>
@@ -108,12 +108,12 @@
           <wp:inline distB="114300" distT="114300" distL="114300" distR="114300">
             <wp:extent cx="5734050" cy="3609975"/>
             <wp:effectExtent b="0" l="0" r="0" t="0"/>
-            <wp:docPr id="5" name="image5.png"/>
+            <wp:docPr id="5" name="image1.png"/>
             <a:graphic>
               <a:graphicData uri="http://schemas.openxmlformats.org/drawingml/2006/picture">
                 <pic:pic>
                   <pic:nvPicPr>
-                    <pic:cNvPr id="0" name="image5.png"/>
+                    <pic:cNvPr id="0" name="image1.png"/>
                     <pic:cNvPicPr preferRelativeResize="0"/>
                   </pic:nvPicPr>
                   <pic:blipFill>
@@ -499,12 +499,12 @@
           <wp:inline distB="114300" distT="114300" distL="114300" distR="114300">
             <wp:extent cx="1150571" cy="1165043"/>
             <wp:effectExtent b="0" l="0" r="0" t="0"/>
-            <wp:docPr id="1" name="image3.png"/>
+            <wp:docPr id="1" name="image5.png"/>
             <a:graphic>
               <a:graphicData uri="http://schemas.openxmlformats.org/drawingml/2006/picture">
                 <pic:pic>
                   <pic:nvPicPr>
-                    <pic:cNvPr id="0" name="image3.png"/>
+                    <pic:cNvPr id="0" name="image5.png"/>
                     <pic:cNvPicPr preferRelativeResize="0"/>
                   </pic:nvPicPr>
                   <pic:blipFill>
@@ -841,11 +841,32 @@
       </w:r>
       <w:r>
         <w:rPr>
-          <w:sz w:val="26"/>
-          <w:szCs w:val="26"/>
-          <w:rtl w:val="0"/>
-        </w:rPr>
-        <w:t xml:space="preserve">__________________</w:t>
+          <w:sz w:val="28"/>
+          <w:szCs w:val="28"/>
+          <w:rtl w:val="0"/>
+        </w:rPr>
+        <w:t xml:space="preserve">            </w:t>
+      </w:r>
+      <w:r>
+        <w:rPr>
+          <w:sz w:val="26"/>
+          <w:szCs w:val="26"/>
+          <w:rtl w:val="0"/>
+        </w:rPr>
+        <w:t xml:space="preserve">{%signature_client}</w:t>
+      </w:r>
+      <w:r>
+        <w:rPr>
+          <w:sz w:val="28"/>
+          <w:szCs w:val="28"/>
+          <w:rtl w:val="0"/>
+        </w:rPr>
+        <w:t xml:space="preserve"> </w:t>
+      </w:r>
+      <w:r>
+        <w:rPr>
+          <w:rtl w:val="0"/>
+        </w:rPr>
       </w:r>
     </w:p>
     <w:p>
@@ -981,11 +1002,32 @@
       </w:r>
       <w:r>
         <w:rPr>
-          <w:sz w:val="26"/>
-          <w:szCs w:val="26"/>
-          <w:rtl w:val="0"/>
-        </w:rPr>
-        <w:t xml:space="preserve">__________________</w:t>
+          <w:sz w:val="28"/>
+          <w:szCs w:val="28"/>
+          <w:rtl w:val="0"/>
+        </w:rPr>
+        <w:t xml:space="preserve">            </w:t>
+      </w:r>
+      <w:r>
+        <w:rPr>
+          <w:sz w:val="26"/>
+          <w:szCs w:val="26"/>
+          <w:rtl w:val="0"/>
+        </w:rPr>
+        <w:t xml:space="preserve">{%signature_client}</w:t>
+      </w:r>
+      <w:r>
+        <w:rPr>
+          <w:sz w:val="28"/>
+          <w:szCs w:val="28"/>
+          <w:rtl w:val="0"/>
+        </w:rPr>
+        <w:t xml:space="preserve"> </w:t>
+      </w:r>
+      <w:r>
+        <w:rPr>
+          <w:rtl w:val="0"/>
+        </w:rPr>
       </w:r>
     </w:p>
     <w:p>
@@ -1067,7 +1109,33 @@
           <w:szCs w:val="26"/>
           <w:rtl w:val="0"/>
         </w:rPr>
-        <w:t xml:space="preserve">__________________</w:t>
+        <w:t xml:space="preserve">     </w:t>
+      </w:r>
+      <w:r>
+        <w:rPr>
+          <w:sz w:val="28"/>
+          <w:szCs w:val="28"/>
+          <w:rtl w:val="0"/>
+        </w:rPr>
+        <w:t xml:space="preserve"> </w:t>
+      </w:r>
+      <w:r>
+        <w:rPr>
+          <w:b w:val="1"/>
+          <w:bCs w:val="1"/>
+          <w:sz w:val="26"/>
+          <w:szCs w:val="26"/>
+          <w:rtl w:val="0"/>
+        </w:rPr>
+        <w:t xml:space="preserve">       </w:t>
+      </w:r>
+      <w:r>
+        <w:rPr>
+          <w:sz w:val="26"/>
+          <w:szCs w:val="26"/>
+          <w:rtl w:val="0"/>
+        </w:rPr>
+        <w:t xml:space="preserve">{%signature_rep}</w:t>
       </w:r>
     </w:p>
     <w:p>

</xml_diff>

<commit_message>
Update contract templates: fix signature placeholder delimiters to {{%signature_client}}
Co-Authored-By: Claude Sonnet 4.6 <noreply@anthropic.com>
</commit_message>
<xml_diff>
--- a/src/lib/contracts/template-en.docx
+++ b/src/lib/contracts/template-en.docx
@@ -12,12 +12,12 @@
           <wp:inline distB="114300" distT="114300" distL="114300" distR="114300">
             <wp:extent cx="5731200" cy="5067300"/>
             <wp:effectExtent b="0" l="0" r="0" t="0"/>
-            <wp:docPr id="6" name="image3.png"/>
+            <wp:docPr id="6" name="image1.png"/>
             <a:graphic>
               <a:graphicData uri="http://schemas.openxmlformats.org/drawingml/2006/picture">
                 <pic:pic>
                   <pic:nvPicPr>
-                    <pic:cNvPr id="0" name="image3.png"/>
+                    <pic:cNvPr id="0" name="image1.png"/>
                     <pic:cNvPicPr preferRelativeResize="0"/>
                   </pic:nvPicPr>
                   <pic:blipFill>
@@ -108,12 +108,12 @@
           <wp:inline distB="114300" distT="114300" distL="114300" distR="114300">
             <wp:extent cx="5734050" cy="3609975"/>
             <wp:effectExtent b="0" l="0" r="0" t="0"/>
-            <wp:docPr id="5" name="image1.png"/>
+            <wp:docPr id="5" name="image4.png"/>
             <a:graphic>
               <a:graphicData uri="http://schemas.openxmlformats.org/drawingml/2006/picture">
                 <pic:pic>
                   <pic:nvPicPr>
-                    <pic:cNvPr id="0" name="image1.png"/>
+                    <pic:cNvPr id="0" name="image4.png"/>
                     <pic:cNvPicPr preferRelativeResize="0"/>
                   </pic:nvPicPr>
                   <pic:blipFill>
@@ -407,12 +407,12 @@
           <wp:inline distB="114300" distT="114300" distL="114300" distR="114300">
             <wp:extent cx="4809833" cy="8960908"/>
             <wp:effectExtent b="0" l="0" r="0" t="0"/>
-            <wp:docPr id="4" name="image4.png"/>
+            <wp:docPr id="4" name="image3.png"/>
             <a:graphic>
               <a:graphicData uri="http://schemas.openxmlformats.org/drawingml/2006/picture">
                 <pic:pic>
                   <pic:nvPicPr>
-                    <pic:cNvPr id="0" name="image4.png"/>
+                    <pic:cNvPr id="0" name="image3.png"/>
                     <pic:cNvPicPr preferRelativeResize="0"/>
                   </pic:nvPicPr>
                   <pic:blipFill>
@@ -845,7 +845,7 @@
           <w:szCs w:val="28"/>
           <w:rtl w:val="0"/>
         </w:rPr>
-        <w:t xml:space="preserve">            </w:t>
+        <w:t xml:space="preserve">            {</w:t>
       </w:r>
       <w:r>
         <w:rPr>
@@ -861,7 +861,7 @@
           <w:szCs w:val="28"/>
           <w:rtl w:val="0"/>
         </w:rPr>
-        <w:t xml:space="preserve"> </w:t>
+        <w:t xml:space="preserve">}</w:t>
       </w:r>
       <w:r>
         <w:rPr>
@@ -1006,7 +1006,7 @@
           <w:szCs w:val="28"/>
           <w:rtl w:val="0"/>
         </w:rPr>
-        <w:t xml:space="preserve">            </w:t>
+        <w:t xml:space="preserve">            {</w:t>
       </w:r>
       <w:r>
         <w:rPr>
@@ -1022,7 +1022,7 @@
           <w:szCs w:val="28"/>
           <w:rtl w:val="0"/>
         </w:rPr>
-        <w:t xml:space="preserve"> </w:t>
+        <w:t xml:space="preserve">}</w:t>
       </w:r>
       <w:r>
         <w:rPr>
@@ -1135,7 +1135,7 @@
           <w:szCs w:val="26"/>
           <w:rtl w:val="0"/>
         </w:rPr>
-        <w:t xml:space="preserve">{%signature_rep}</w:t>
+        <w:t xml:space="preserve">{{%signature_rep}}</w:t>
       </w:r>
     </w:p>
     <w:p>

</xml_diff>